<commit_message>
Sua bai phan tich
</commit_message>
<xml_diff>
--- a/10BaiPhanTichConLai.docx
+++ b/10BaiPhanTichConLai.docx
@@ -4,12 +4,24 @@
   <w:body>
     <w:p>
       <w:pPr>
-        <w:ind w:firstLine="720" w:firstLineChars="0"/>
+        <w:pStyle w:val="249"/>
+        <w:bidi w:val="0"/>
         <w:rPr>
           <w:rFonts w:hint="default"/>
+          <w:b/>
+          <w:bCs/>
           <w:lang w:val="vi-VN"/>
         </w:rPr>
       </w:pPr>
+      <w:r>
+        <w:rPr>
+          <w:rFonts w:hint="default"/>
+          <w:b/>
+          <w:bCs/>
+          <w:lang w:val="vi-VN"/>
+        </w:rPr>
+        <w:t>Tổng hợp 10 bài phân tích và tóm tắt</w:t>
+      </w:r>
     </w:p>
     <w:p/>
     <w:p>
@@ -84,15 +96,7 @@
         <w:rPr>
           <w:rFonts w:hint="default"/>
         </w:rPr>
-        <w:t>Khai thác ý kiến bằng phương pháp học máy kết hợp (Ensemble Model): Thay vì chỉ dùng một mô hình đ</w:t>
-      </w:r>
-      <w:bookmarkStart w:id="0" w:name="_GoBack"/>
-      <w:bookmarkEnd w:id="0"/>
-      <w:r>
-        <w:rPr>
-          <w:rFonts w:hint="default"/>
-        </w:rPr>
-        <w:t>ơn lẻ, nghiên cứu này kết hợp Support Vector Machine (SVM), Logistic Regression, và Multinomial Naive Bayes để tạo ra một bộ phân loại "bỏ phiếu theo số đông" (majority voting classifier). Mô hình kết hợp này đem lại độ chính xác 88,27% với thời gian xử lý rất tối ưu, cung cấp cho các chủ nhà hàng công cụ phân tích phản hồi nhanh chóng và hiệu quả,.</w:t>
+        <w:t>Khai thác ý kiến bằng phương pháp học máy kết hợp (Ensemble Model): Thay vì chỉ dùng một mô hình đơn lẻ, nghiên cứu này kết hợp Support Vector Machine (SVM), Logistic Regression, và Multinomial Naive Bayes để tạo ra một bộ phân loại "bỏ phiếu theo số đông" (majority voting classifier). Mô hình kết hợp này đem lại độ chính xác 88,27% với thời gian xử lý rất tối ưu, cung cấp cho các chủ nhà hàng công cụ phân tích phản hồi nhanh chóng và hiệu quả,.</w:t>
       </w:r>
     </w:p>
     <w:p>
@@ -294,11 +298,38 @@
     </w:p>
     <w:p>
       <w:pPr>
+        <w:pStyle w:val="250"/>
+        <w:bidi w:val="0"/>
         <w:rPr>
           <w:rFonts w:hint="default"/>
           <w:lang w:val="vi-VN"/>
         </w:rPr>
       </w:pPr>
+      <w:r>
+        <w:rPr>
+          <w:rFonts w:hint="default"/>
+          <w:lang w:val="vi-VN"/>
+        </w:rPr>
+        <w:t>Tóm tắt</w:t>
+      </w:r>
+    </w:p>
+    <w:p>
+      <w:pPr>
+        <w:pStyle w:val="249"/>
+        <w:bidi w:val="0"/>
+        <w:rPr>
+          <w:rFonts w:hint="default"/>
+          <w:lang w:val="vi-VN"/>
+        </w:rPr>
+      </w:pPr>
+      <w:r>
+        <w:t>Toàn bộ 10 nghiên cứu đều minh chứng ch</w:t>
+      </w:r>
+      <w:bookmarkStart w:id="0" w:name="_GoBack"/>
+      <w:bookmarkEnd w:id="0"/>
+      <w:r>
+        <w:t>o việc chuyển đổi số và tiếp cận dựa trên dữ liệu đang tái định hình lại ngành nhà hàng. Từ việc lắng nghe ý kiến trên mạng xã hội, phòng ngừa phá sản, thiết kế hệ thống gợi ý, tối ưu đặt bàn bằng đấu giá, đào tạo thực tế ảo cho tới can thiệp về giá để cải thiện sức khỏe cộng đồng. Sự kết hợp giữa máy học, trí tuệ nhân tạo và kinh tế học hành vi đang giúp tối ưu hóa mọi điểm chạm (touchpoint) giữa khách hàng và nhà cung cấp dịch vụ.</w:t>
+      </w:r>
     </w:p>
     <w:sectPr>
       <w:pgSz w:w="11906" w:h="16838"/>

</xml_diff>